<commit_message>
make sure the optimized-TI(t) function, and figure out there's still 4 factors need to be consider
</commit_message>
<xml_diff>
--- a/research_materials/system_design/Derivation_WANG_HAOXIN.docx
+++ b/research_materials/system_design/Derivation_WANG_HAOXIN.docx
@@ -717,8 +717,16 @@
       <w:pPr>
         <w:rPr>
           <w:rFonts w:hint="eastAsia"/>
+          <w:b/>
+          <w:bCs/>
+          <w:color w:val="E54C5E" w:themeColor="accent6"/>
           <w:position w:val="-24"/>
           <w:lang w:val="en-US" w:eastAsia="zh-CN"/>
+          <w14:textFill>
+            <w14:solidFill>
+              <w14:schemeClr w14:val="accent6"/>
+            </w14:solidFill>
+          </w14:textFill>
         </w:rPr>
       </w:pPr>
       <w:r>
@@ -727,7 +735,23 @@
           <w:position w:val="-24"/>
           <w:lang w:val="en-US" w:eastAsia="zh-CN"/>
         </w:rPr>
-        <w:t>其中: α(t)=kdiff​(t)⋅αws​(t)+(1−kdiff​(t))⋅αbs​(θSun​,t)</w:t>
+        <w:t xml:space="preserve">其中: </w:t>
+      </w:r>
+      <w:r>
+        <w:rPr>
+          <w:rFonts w:hint="eastAsia"/>
+          <w:b/>
+          <w:bCs/>
+          <w:color w:val="E54C5E" w:themeColor="accent6"/>
+          <w:position w:val="-24"/>
+          <w:lang w:val="en-US" w:eastAsia="zh-CN"/>
+          <w14:textFill>
+            <w14:solidFill>
+              <w14:schemeClr w14:val="accent6"/>
+            </w14:solidFill>
+          </w14:textFill>
+        </w:rPr>
+        <w:t>α(t)=kdiff​(t)⋅αws​(t)+(1−kdiff​(t))⋅αbs​(θSun​,t)</w:t>
       </w:r>
     </w:p>
     <w:p>
@@ -1212,219 +1236,1021 @@
     <w:p>
       <w:pPr>
         <w:rPr>
-          <w:rFonts w:hint="default"/>
-          <w:position w:val="-14"/>
-        </w:rPr>
-      </w:pPr>
-    </w:p>
-    <w:p>
-      <w:pPr>
-        <w:rPr>
-          <w:rFonts w:hint="default"/>
-          <w:position w:val="-14"/>
-        </w:rPr>
-      </w:pPr>
-      <w:r>
-        <w:rPr>
-          <w:rFonts w:hint="default"/>
-          <w:position w:val="-14"/>
-        </w:rPr>
-        <w:t xml:space="preserve">公式体现： </w:t>
-      </w:r>
-      <w:r>
-        <w:rPr>
-          <w:b/>
-          <w:bCs/>
-          <w:position w:val="-14"/>
-        </w:rPr>
-        <w:t>T</w:t>
-      </w:r>
-      <w:r>
-        <w:rPr>
-          <w:rFonts w:hint="default"/>
-          <w:b/>
-          <w:bCs/>
-          <w:position w:val="-14"/>
-        </w:rPr>
-        <w:t>I</w:t>
-      </w:r>
-      <w:r>
-        <w:rPr>
-          <w:b/>
-          <w:bCs/>
-          <w:position w:val="-14"/>
-        </w:rPr>
-        <w:t>(</w:t>
-      </w:r>
-      <w:r>
-        <w:rPr>
-          <w:rFonts w:hint="default"/>
-          <w:b/>
-          <w:bCs/>
-          <w:position w:val="-14"/>
-        </w:rPr>
-        <w:t>t)=DNI(t)⋅cos(AOI)⋅fIAM​(AOI)+DHI(t)⋅fIAM,diff​+GD(t)</w:t>
-      </w:r>
-      <w:r>
-        <w:rPr>
-          <w:rFonts w:hint="default"/>
-          <w:position w:val="-14"/>
-        </w:rPr>
-        <w:t>，其中 fIAM​ 随入射角动态变化。</w:t>
-      </w:r>
-    </w:p>
-    <w:p>
-      <w:pPr>
-        <w:rPr>
-          <w:rFonts w:hint="default"/>
-          <w:position w:val="-14"/>
-        </w:rPr>
-      </w:pPr>
-    </w:p>
-    <w:p>
-      <w:pPr>
-        <w:rPr>
-          <w:rFonts w:hint="default"/>
-          <w:position w:val="-14"/>
-        </w:rPr>
-      </w:pPr>
-      <w:r>
-        <w:rPr>
-          <w:rFonts w:hint="eastAsia"/>
-          <w:position w:val="-14"/>
-          <w:lang w:val="en-US" w:eastAsia="zh-CN"/>
-        </w:rPr>
-        <w:t xml:space="preserve">** </w:t>
-      </w:r>
-      <w:r>
-        <w:rPr>
-          <w:rFonts w:hint="default"/>
-          <w:position w:val="-14"/>
-        </w:rPr>
-        <w:t>TIopt(t)=Direct+正面天空散DHI(t)⋅</w:t>
-      </w:r>
-      <w:r>
-        <w:rPr>
-          <w:rFonts w:hint="eastAsia"/>
-          <w:position w:val="-14"/>
-          <w:lang w:val="en-US" w:eastAsia="zh-CN"/>
-        </w:rPr>
-        <w:t>(</w:t>
-      </w:r>
-      <w:r>
-        <w:rPr>
-          <w:rFonts w:hint="default"/>
-          <w:position w:val="-14"/>
-        </w:rPr>
-        <w:t>1+cosβ</w:t>
-      </w:r>
-      <w:r>
-        <w:rPr>
-          <w:rFonts w:hint="eastAsia"/>
-          <w:position w:val="-14"/>
-          <w:lang w:val="en-US" w:eastAsia="zh-CN"/>
-        </w:rPr>
-        <w:t>)/2</w:t>
-      </w:r>
-      <w:r>
-        <w:rPr>
-          <w:rFonts w:hint="default"/>
-          <w:position w:val="-14"/>
-        </w:rPr>
-        <w:t>+正面地面反射GHI(t)</w:t>
-      </w:r>
-      <w:r>
-        <w:rPr>
-          <w:rFonts w:hint="eastAsia"/>
-          <w:position w:val="-14"/>
-          <w:lang w:val="en-US" w:eastAsia="zh-CN"/>
-        </w:rPr>
-        <w:t xml:space="preserve"> </w:t>
-      </w:r>
-      <w:r>
-        <w:rPr>
-          <w:rFonts w:hint="default"/>
-          <w:position w:val="-14"/>
+          <w:rFonts w:hint="eastAsia"/>
+          <w:b/>
+          <w:bCs/>
+          <w:color w:val="E54C5E" w:themeColor="accent6"/>
+          <w:position w:val="-24"/>
+          <w:lang w:val="en-US" w:eastAsia="zh-CN"/>
+          <w14:textFill>
+            <w14:solidFill>
+              <w14:schemeClr w14:val="accent6"/>
+            </w14:solidFill>
+          </w14:textFill>
+        </w:rPr>
+      </w:pPr>
+    </w:p>
+    <w:p>
+      <w:pPr>
+        <w:rPr>
+          <w:rFonts w:hint="default"/>
+          <w:b/>
+          <w:bCs/>
+          <w:color w:val="E54C5E" w:themeColor="accent6"/>
+          <w:position w:val="-14"/>
+          <w:lang w:val="en-US" w:eastAsia="zh-CN"/>
+          <w14:textFill>
+            <w14:solidFill>
+              <w14:schemeClr w14:val="accent6"/>
+            </w14:solidFill>
+          </w14:textFill>
+        </w:rPr>
+      </w:pPr>
+      <w:r>
+        <w:rPr>
+          <w:rFonts w:hint="default"/>
+          <w:b/>
+          <w:bCs/>
+          <w:color w:val="E54C5E" w:themeColor="accent6"/>
+          <w:position w:val="-14"/>
+          <w:lang w:val="en-US" w:eastAsia="zh-CN"/>
+          <w14:textFill>
+            <w14:solidFill>
+              <w14:schemeClr w14:val="accent6"/>
+            </w14:solidFill>
+          </w14:textFill>
+        </w:rPr>
+        <w:t>TI(t)=DNI(t)</w:t>
+      </w:r>
+      <w:r>
+        <w:rPr>
+          <w:rFonts w:hint="eastAsia"/>
+          <w:b/>
+          <w:bCs/>
+          <w:color w:val="E54C5E" w:themeColor="accent6"/>
+          <w:position w:val="-14"/>
+          <w:lang w:val="en-US" w:eastAsia="zh-CN"/>
+          <w14:textFill>
+            <w14:solidFill>
+              <w14:schemeClr w14:val="accent6"/>
+            </w14:solidFill>
+          </w14:textFill>
+        </w:rPr>
+        <w:t>*</w:t>
+      </w:r>
+      <w:r>
+        <w:rPr>
+          <w:rFonts w:hint="default"/>
+          <w:b/>
+          <w:bCs/>
+          <w:color w:val="E54C5E" w:themeColor="accent6"/>
+          <w:position w:val="-14"/>
+          <w:lang w:val="en-US" w:eastAsia="zh-CN"/>
+          <w14:textFill>
+            <w14:solidFill>
+              <w14:schemeClr w14:val="accent6"/>
+            </w14:solidFill>
+          </w14:textFill>
+        </w:rPr>
+        <w:t>cos(AOI)</w:t>
+      </w:r>
+      <w:r>
+        <w:rPr>
+          <w:rFonts w:hint="eastAsia"/>
+          <w:b/>
+          <w:bCs/>
+          <w:color w:val="E54C5E" w:themeColor="accent6"/>
+          <w:position w:val="-14"/>
+          <w:lang w:val="en-US" w:eastAsia="zh-CN"/>
+          <w14:textFill>
+            <w14:solidFill>
+              <w14:schemeClr w14:val="accent6"/>
+            </w14:solidFill>
+          </w14:textFill>
+        </w:rPr>
+        <w:t>*</w:t>
+      </w:r>
+      <w:r>
+        <w:rPr>
+          <w:rFonts w:hint="default"/>
+          <w:b/>
+          <w:bCs/>
+          <w:color w:val="E54C5E" w:themeColor="accent6"/>
+          <w:position w:val="-14"/>
+          <w:lang w:val="en-US" w:eastAsia="zh-CN"/>
+          <w14:textFill>
+            <w14:solidFill>
+              <w14:schemeClr w14:val="accent6"/>
+            </w14:solidFill>
+          </w14:textFill>
+        </w:rPr>
+        <w:t>fIAM(AOI)</w:t>
+      </w:r>
+      <w:r>
+        <w:rPr>
+          <w:rFonts w:hint="eastAsia"/>
+          <w:b/>
+          <w:bCs/>
+          <w:color w:val="E54C5E" w:themeColor="accent6"/>
+          <w:position w:val="-14"/>
+          <w:lang w:val="en-US" w:eastAsia="zh-CN"/>
+          <w14:textFill>
+            <w14:solidFill>
+              <w14:schemeClr w14:val="accent6"/>
+            </w14:solidFill>
+          </w14:textFill>
+        </w:rPr>
+        <w:t>+</w:t>
+      </w:r>
+      <w:r>
+        <w:rPr>
+          <w:rFonts w:hint="default"/>
+          <w:b/>
+          <w:bCs/>
+          <w:color w:val="E54C5E" w:themeColor="accent6"/>
+          <w:position w:val="-14"/>
+          <w:lang w:val="en-US" w:eastAsia="zh-CN"/>
+          <w14:textFill>
+            <w14:solidFill>
+              <w14:schemeClr w14:val="accent6"/>
+            </w14:solidFill>
+          </w14:textFill>
+        </w:rPr>
+        <w:t>DHI(t)</w:t>
+      </w:r>
+      <w:r>
+        <w:rPr>
+          <w:rFonts w:hint="eastAsia"/>
+          <w:b/>
+          <w:bCs/>
+          <w:color w:val="E54C5E" w:themeColor="accent6"/>
+          <w:position w:val="-14"/>
+          <w:lang w:val="en-US" w:eastAsia="zh-CN"/>
+          <w14:textFill>
+            <w14:solidFill>
+              <w14:schemeClr w14:val="accent6"/>
+            </w14:solidFill>
+          </w14:textFill>
+        </w:rPr>
+        <w:t>*</w:t>
+      </w:r>
+      <w:r>
+        <w:rPr>
+          <w:rFonts w:hint="default"/>
+          <w:b/>
+          <w:bCs/>
+          <w:color w:val="E54C5E" w:themeColor="accent6"/>
+          <w:position w:val="-14"/>
+          <w:lang w:val="en-US" w:eastAsia="zh-CN"/>
+          <w14:textFill>
+            <w14:solidFill>
+              <w14:schemeClr w14:val="accent6"/>
+            </w14:solidFill>
+          </w14:textFill>
+        </w:rPr>
+        <w:t>fIAM,diff</w:t>
+      </w:r>
+      <w:r>
+        <w:rPr>
+          <w:rFonts w:hint="eastAsia"/>
+          <w:b/>
+          <w:bCs/>
+          <w:color w:val="E54C5E" w:themeColor="accent6"/>
+          <w:position w:val="-14"/>
+          <w:lang w:val="en-US" w:eastAsia="zh-CN"/>
+          <w14:textFill>
+            <w14:solidFill>
+              <w14:schemeClr w14:val="accent6"/>
+            </w14:solidFill>
+          </w14:textFill>
+        </w:rPr>
+        <w:t>*(</w:t>
+      </w:r>
+      <w:r>
+        <w:rPr>
+          <w:rFonts w:hint="default"/>
+          <w:b/>
+          <w:bCs/>
+          <w:color w:val="E54C5E" w:themeColor="accent6"/>
+          <w:position w:val="-14"/>
+          <w:lang w:val="en-US" w:eastAsia="zh-CN"/>
+          <w14:textFill>
+            <w14:solidFill>
+              <w14:schemeClr w14:val="accent6"/>
+            </w14:solidFill>
+          </w14:textFill>
+        </w:rPr>
+        <w:t>(1+cosβ)</w:t>
+      </w:r>
+      <w:r>
+        <w:rPr>
+          <w:rFonts w:hint="eastAsia"/>
+          <w:b/>
+          <w:bCs/>
+          <w:color w:val="E54C5E" w:themeColor="accent6"/>
+          <w:position w:val="-14"/>
+          <w:lang w:val="en-US" w:eastAsia="zh-CN"/>
+          <w14:textFill>
+            <w14:solidFill>
+              <w14:schemeClr w14:val="accent6"/>
+            </w14:solidFill>
+          </w14:textFill>
+        </w:rPr>
+        <w:t xml:space="preserve">/2)+ </w:t>
+      </w:r>
+      <w:r>
+        <w:rPr>
+          <w:rFonts w:hint="default"/>
+          <w:b/>
+          <w:bCs/>
+          <w:color w:val="E54C5E" w:themeColor="accent6"/>
+          <w:position w:val="-14"/>
+          <w:lang w:val="en-US" w:eastAsia="zh-CN"/>
+          <w14:textFill>
+            <w14:solidFill>
+              <w14:schemeClr w14:val="accent6"/>
+            </w14:solidFill>
+          </w14:textFill>
+        </w:rPr>
+        <w:t>GHI(t)</w:t>
+      </w:r>
+      <w:r>
+        <w:rPr>
+          <w:rFonts w:hint="eastAsia"/>
+          <w:b/>
+          <w:bCs/>
+          <w:color w:val="E54C5E" w:themeColor="accent6"/>
+          <w:position w:val="-14"/>
+          <w:lang w:val="en-US" w:eastAsia="zh-CN"/>
+          <w14:textFill>
+            <w14:solidFill>
+              <w14:schemeClr w14:val="accent6"/>
+            </w14:solidFill>
+          </w14:textFill>
+        </w:rPr>
+        <w:t>*</w:t>
+      </w:r>
+      <w:r>
+        <w:rPr>
+          <w:rFonts w:hint="default"/>
+          <w:b/>
+          <w:bCs/>
+          <w:color w:val="E54C5E" w:themeColor="accent6"/>
+          <w:position w:val="-14"/>
+          <w:lang w:val="en-US" w:eastAsia="zh-CN"/>
+          <w14:textFill>
+            <w14:solidFill>
+              <w14:schemeClr w14:val="accent6"/>
+            </w14:solidFill>
+          </w14:textFill>
         </w:rPr>
         <w:t>αeff′(t)</w:t>
       </w:r>
       <w:r>
         <w:rPr>
           <w:rFonts w:hint="eastAsia"/>
-          <w:position w:val="-14"/>
-          <w:lang w:val="en-US" w:eastAsia="zh-CN"/>
-        </w:rPr>
-        <w:t>(</w:t>
-      </w:r>
-      <w:r>
-        <w:rPr>
-          <w:rFonts w:hint="default"/>
-          <w:position w:val="-14"/>
-        </w:rPr>
-        <w:t>1+cosβ</w:t>
-      </w:r>
-      <w:r>
-        <w:rPr>
-          <w:rFonts w:hint="eastAsia"/>
-          <w:position w:val="-14"/>
-          <w:lang w:val="en-US" w:eastAsia="zh-CN"/>
-        </w:rPr>
-        <w:t>)/2</w:t>
-      </w:r>
-    </w:p>
-    <w:p>
-      <w:pPr>
-        <w:rPr>
-          <w:rFonts w:hint="eastAsia"/>
-          <w:position w:val="-14"/>
-          <w:lang w:val="en-US" w:eastAsia="zh-CN"/>
-        </w:rPr>
-      </w:pPr>
-      <w:r>
-        <w:rPr>
-          <w:rFonts w:hint="eastAsia"/>
-          <w:position w:val="-14"/>
-          <w:lang w:val="en-US" w:eastAsia="zh-CN"/>
-        </w:rPr>
-        <w:t>***</w:t>
-      </w:r>
-    </w:p>
-    <w:p>
-      <w:pPr>
-        <w:rPr>
-          <w:rFonts w:hint="default"/>
-          <w:position w:val="-14"/>
-          <w:lang w:val="en-US" w:eastAsia="zh-CN"/>
-        </w:rPr>
-      </w:pPr>
-      <w:r>
-        <w:rPr>
-          <w:rFonts w:hint="eastAsia"/>
-          <w:position w:val="-14"/>
-          <w:lang w:val="en-US" w:eastAsia="zh-CN"/>
-        </w:rPr>
-        <w:t>------------------------------------------------------------------------------------------------------------------------------</w:t>
-      </w:r>
-    </w:p>
-    <w:p>
-      <w:pPr>
-        <w:rPr>
-          <w:rFonts w:hint="default"/>
-          <w:position w:val="-14"/>
-        </w:rPr>
-      </w:pPr>
-      <w:r>
-        <w:rPr>
-          <w:position w:val="-14"/>
-        </w:rPr>
-        <w:t>在代码中强制执行一个判定：if Solar_Elevation &lt; 10: alpha(t) = 修正值</w:t>
-      </w:r>
-      <w:r>
-        <w:rPr>
-          <w:rFonts w:hint="default"/>
-          <w:position w:val="-14"/>
-        </w:rPr>
-        <w:t>。</w:t>
+          <w:b/>
+          <w:bCs/>
+          <w:color w:val="E54C5E" w:themeColor="accent6"/>
+          <w:position w:val="-14"/>
+          <w:lang w:val="en-US" w:eastAsia="zh-CN"/>
+          <w14:textFill>
+            <w14:solidFill>
+              <w14:schemeClr w14:val="accent6"/>
+            </w14:solidFill>
+          </w14:textFill>
+        </w:rPr>
+        <w:t>*(</w:t>
+      </w:r>
+      <w:r>
+        <w:rPr>
+          <w:rFonts w:hint="default"/>
+          <w:b/>
+          <w:bCs/>
+          <w:color w:val="E54C5E" w:themeColor="accent6"/>
+          <w:position w:val="-14"/>
+          <w:lang w:val="en-US" w:eastAsia="zh-CN"/>
+          <w14:textFill>
+            <w14:solidFill>
+              <w14:schemeClr w14:val="accent6"/>
+            </w14:solidFill>
+          </w14:textFill>
+        </w:rPr>
+        <w:t>(1</w:t>
+      </w:r>
+      <w:r>
+        <w:rPr>
+          <w:rFonts w:hint="eastAsia"/>
+          <w:b/>
+          <w:bCs/>
+          <w:color w:val="E54C5E" w:themeColor="accent6"/>
+          <w:position w:val="-14"/>
+          <w:lang w:val="en-US" w:eastAsia="zh-CN"/>
+          <w14:textFill>
+            <w14:solidFill>
+              <w14:schemeClr w14:val="accent6"/>
+            </w14:solidFill>
+          </w14:textFill>
+        </w:rPr>
+        <w:t>-</w:t>
+      </w:r>
+      <w:r>
+        <w:rPr>
+          <w:rFonts w:hint="default"/>
+          <w:b/>
+          <w:bCs/>
+          <w:color w:val="E54C5E" w:themeColor="accent6"/>
+          <w:position w:val="-14"/>
+          <w:lang w:val="en-US" w:eastAsia="zh-CN"/>
+          <w14:textFill>
+            <w14:solidFill>
+              <w14:schemeClr w14:val="accent6"/>
+            </w14:solidFill>
+          </w14:textFill>
+        </w:rPr>
+        <w:t>cosβ)</w:t>
+      </w:r>
+      <w:r>
+        <w:rPr>
+          <w:rFonts w:hint="eastAsia"/>
+          <w:b/>
+          <w:bCs/>
+          <w:color w:val="E54C5E" w:themeColor="accent6"/>
+          <w:position w:val="-14"/>
+          <w:lang w:val="en-US" w:eastAsia="zh-CN"/>
+          <w14:textFill>
+            <w14:solidFill>
+              <w14:schemeClr w14:val="accent6"/>
+            </w14:solidFill>
+          </w14:textFill>
+        </w:rPr>
+        <w:t>/2)</w:t>
+      </w:r>
+      <w:r>
+        <w:rPr>
+          <w:rFonts w:hint="default"/>
+          <w:b/>
+          <w:bCs/>
+          <w:color w:val="E54C5E" w:themeColor="accent6"/>
+          <w:position w:val="-14"/>
+          <w:lang w:val="en-US" w:eastAsia="zh-CN"/>
+          <w14:textFill>
+            <w14:solidFill>
+              <w14:schemeClr w14:val="accent6"/>
+            </w14:solidFill>
+          </w14:textFill>
+        </w:rPr>
+        <w:t>​</w:t>
+      </w:r>
+    </w:p>
+    <w:p>
+      <w:pPr>
+        <w:rPr>
+          <w:rFonts w:hint="default"/>
+          <w:b/>
+          <w:bCs/>
+          <w:color w:val="E54C5E" w:themeColor="accent6"/>
+          <w:position w:val="-14"/>
+          <w:lang w:val="en-US" w:eastAsia="zh-CN"/>
+          <w14:textFill>
+            <w14:solidFill>
+              <w14:schemeClr w14:val="accent6"/>
+            </w14:solidFill>
+          </w14:textFill>
+        </w:rPr>
+      </w:pPr>
+      <w:r>
+        <w:rPr>
+          <w:rFonts w:hint="eastAsia"/>
+          <w:b/>
+          <w:bCs/>
+          <w:position w:val="-14"/>
+          <w:lang w:val="en-US" w:eastAsia="zh-CN"/>
+        </w:rPr>
+        <w:t>其中:</w:t>
+      </w:r>
+      <w:r>
+        <w:rPr>
+          <w:rFonts w:hint="default"/>
+          <w:b/>
+          <w:bCs/>
+          <w:color w:val="E54C5E" w:themeColor="accent6"/>
+          <w:position w:val="-14"/>
+          <w:lang w:val="en-US" w:eastAsia="zh-CN"/>
+          <w14:textFill>
+            <w14:solidFill>
+              <w14:schemeClr w14:val="accent6"/>
+            </w14:solidFill>
+          </w14:textFill>
+        </w:rPr>
+        <w:t>αeff′(t)=[kdiff(t)</w:t>
+      </w:r>
+      <w:r>
+        <w:rPr>
+          <w:rFonts w:hint="eastAsia"/>
+          <w:b/>
+          <w:bCs/>
+          <w:color w:val="E54C5E" w:themeColor="accent6"/>
+          <w:position w:val="-14"/>
+          <w:lang w:val="en-US" w:eastAsia="zh-CN"/>
+          <w14:textFill>
+            <w14:solidFill>
+              <w14:schemeClr w14:val="accent6"/>
+            </w14:solidFill>
+          </w14:textFill>
+        </w:rPr>
+        <w:t>*</w:t>
+      </w:r>
+      <w:r>
+        <w:rPr>
+          <w:rFonts w:hint="default"/>
+          <w:b/>
+          <w:bCs/>
+          <w:color w:val="E54C5E" w:themeColor="accent6"/>
+          <w:position w:val="-14"/>
+          <w:lang w:val="en-US" w:eastAsia="zh-CN"/>
+          <w14:textFill>
+            <w14:solidFill>
+              <w14:schemeClr w14:val="accent6"/>
+            </w14:solidFill>
+          </w14:textFill>
+        </w:rPr>
+        <w:t>αws(t)+(1−kdiff(t))</w:t>
+      </w:r>
+      <w:r>
+        <w:rPr>
+          <w:rFonts w:hint="eastAsia"/>
+          <w:b/>
+          <w:bCs/>
+          <w:color w:val="E54C5E" w:themeColor="accent6"/>
+          <w:position w:val="-14"/>
+          <w:lang w:val="en-US" w:eastAsia="zh-CN"/>
+          <w14:textFill>
+            <w14:solidFill>
+              <w14:schemeClr w14:val="accent6"/>
+            </w14:solidFill>
+          </w14:textFill>
+        </w:rPr>
+        <w:t>*</w:t>
+      </w:r>
+      <w:r>
+        <w:rPr>
+          <w:rFonts w:hint="default"/>
+          <w:b/>
+          <w:bCs/>
+          <w:color w:val="E54C5E" w:themeColor="accent6"/>
+          <w:position w:val="-14"/>
+          <w:lang w:val="en-US" w:eastAsia="zh-CN"/>
+          <w14:textFill>
+            <w14:solidFill>
+              <w14:schemeClr w14:val="accent6"/>
+            </w14:solidFill>
+          </w14:textFill>
+        </w:rPr>
+        <w:t>αbs(θSun</w:t>
+      </w:r>
+      <w:r>
+        <w:rPr>
+          <w:rFonts w:hint="eastAsia"/>
+          <w:b/>
+          <w:bCs/>
+          <w:color w:val="E54C5E" w:themeColor="accent6"/>
+          <w:position w:val="-14"/>
+          <w:lang w:val="en-US" w:eastAsia="zh-CN"/>
+          <w14:textFill>
+            <w14:solidFill>
+              <w14:schemeClr w14:val="accent6"/>
+            </w14:solidFill>
+          </w14:textFill>
+        </w:rPr>
+        <w:t>,</w:t>
+      </w:r>
+      <w:r>
+        <w:rPr>
+          <w:rFonts w:hint="default"/>
+          <w:b/>
+          <w:bCs/>
+          <w:color w:val="E54C5E" w:themeColor="accent6"/>
+          <w:position w:val="-14"/>
+          <w:lang w:val="en-US" w:eastAsia="zh-CN"/>
+          <w14:textFill>
+            <w14:solidFill>
+              <w14:schemeClr w14:val="accent6"/>
+            </w14:solidFill>
+          </w14:textFill>
+        </w:rPr>
+        <w:t>t</w:t>
+      </w:r>
+      <w:r>
+        <w:rPr>
+          <w:rFonts w:hint="eastAsia"/>
+          <w:b/>
+          <w:bCs/>
+          <w:color w:val="E54C5E" w:themeColor="accent6"/>
+          <w:position w:val="-14"/>
+          <w:lang w:val="en-US" w:eastAsia="zh-CN"/>
+          <w14:textFill>
+            <w14:solidFill>
+              <w14:schemeClr w14:val="accent6"/>
+            </w14:solidFill>
+          </w14:textFill>
+        </w:rPr>
+        <w:t>)</w:t>
+      </w:r>
+      <w:r>
+        <w:rPr>
+          <w:rFonts w:hint="default"/>
+          <w:b/>
+          <w:bCs/>
+          <w:color w:val="E54C5E" w:themeColor="accent6"/>
+          <w:position w:val="-14"/>
+          <w:lang w:val="en-US" w:eastAsia="zh-CN"/>
+          <w14:textFill>
+            <w14:solidFill>
+              <w14:schemeClr w14:val="accent6"/>
+            </w14:solidFill>
+          </w14:textFill>
+        </w:rPr>
+        <w:t>]</w:t>
+      </w:r>
+      <w:r>
+        <w:rPr>
+          <w:rFonts w:hint="eastAsia"/>
+          <w:b/>
+          <w:bCs/>
+          <w:color w:val="E54C5E" w:themeColor="accent6"/>
+          <w:position w:val="-14"/>
+          <w:lang w:val="en-US" w:eastAsia="zh-CN"/>
+          <w14:textFill>
+            <w14:solidFill>
+              <w14:schemeClr w14:val="accent6"/>
+            </w14:solidFill>
+          </w14:textFill>
+        </w:rPr>
+        <w:t>*</w:t>
+      </w:r>
+      <w:r>
+        <w:rPr>
+          <w:rFonts w:hint="default"/>
+          <w:b/>
+          <w:bCs/>
+          <w:color w:val="E54C5E" w:themeColor="accent6"/>
+          <w:position w:val="-14"/>
+          <w:lang w:val="en-US" w:eastAsia="zh-CN"/>
+          <w14:textFill>
+            <w14:solidFill>
+              <w14:schemeClr w14:val="accent6"/>
+            </w14:solidFill>
+          </w14:textFill>
+        </w:rPr>
+        <w:t>0.98</w:t>
+      </w:r>
+      <w:r>
+        <w:rPr>
+          <w:rFonts w:hint="eastAsia"/>
+          <w:b/>
+          <w:bCs/>
+          <w:color w:val="E54C5E" w:themeColor="accent6"/>
+          <w:position w:val="-14"/>
+          <w:lang w:val="en-US" w:eastAsia="zh-CN"/>
+          <w14:textFill>
+            <w14:solidFill>
+              <w14:schemeClr w14:val="accent6"/>
+            </w14:solidFill>
+          </w14:textFill>
+        </w:rPr>
+        <w:t>*</w:t>
+      </w:r>
+      <w:r>
+        <w:rPr>
+          <w:rFonts w:hint="default"/>
+          <w:b/>
+          <w:bCs/>
+          <w:color w:val="E54C5E" w:themeColor="accent6"/>
+          <w:position w:val="-14"/>
+          <w:lang w:val="en-US" w:eastAsia="zh-CN"/>
+          <w14:textFill>
+            <w14:solidFill>
+              <w14:schemeClr w14:val="accent6"/>
+            </w14:solidFill>
+          </w14:textFill>
+        </w:rPr>
+        <w:t>flow_sun(γ)</w:t>
+      </w:r>
+    </w:p>
+    <w:p>
+      <w:pPr>
+        <w:rPr>
+          <w:rFonts w:hint="default"/>
+          <w:b/>
+          <w:bCs/>
+          <w:color w:val="E54C5E" w:themeColor="accent6"/>
+          <w:position w:val="-14"/>
+          <w:lang w:val="en-US" w:eastAsia="zh-CN"/>
+          <w14:textFill>
+            <w14:solidFill>
+              <w14:schemeClr w14:val="accent6"/>
+            </w14:solidFill>
+          </w14:textFill>
+        </w:rPr>
+      </w:pPr>
+    </w:p>
+    <w:p>
+      <w:pPr>
+        <w:rPr>
+          <w:rFonts w:hint="eastAsia"/>
+          <w:position w:val="-14"/>
+          <w:lang w:val="en-US" w:eastAsia="zh-CN"/>
+        </w:rPr>
+      </w:pPr>
+      <w:r>
+        <w:rPr>
+          <w:rFonts w:hint="eastAsia"/>
+          <w:position w:val="-14"/>
+          <w:lang w:val="en-US" w:eastAsia="zh-CN"/>
+        </w:rPr>
+        <w:t>此模型还需做4个优化:</w:t>
+      </w:r>
+    </w:p>
+    <w:p>
+      <w:pPr>
+        <w:rPr>
+          <w:rFonts w:hint="default"/>
+          <w:position w:val="-14"/>
+          <w:lang w:val="en-US" w:eastAsia="zh-CN"/>
+        </w:rPr>
+      </w:pPr>
+      <w:r>
+        <w:rPr>
+          <w:rFonts w:hint="eastAsia"/>
+          <w:position w:val="-14"/>
+          <w:lang w:val="en-US" w:eastAsia="zh-CN"/>
+        </w:rPr>
+        <w:t xml:space="preserve">---&gt; </w:t>
+      </w:r>
+      <w:r>
+        <w:rPr>
+          <w:rFonts w:hint="default"/>
+          <w:position w:val="-14"/>
+          <w:lang w:val="en-US" w:eastAsia="zh-CN"/>
+        </w:rPr>
+        <w:t>雪损模型（Snow Loss Model）</w:t>
+      </w:r>
+    </w:p>
+    <w:p>
+      <w:pPr>
+        <w:rPr>
+          <w:rFonts w:hint="default"/>
+          <w:position w:val="-14"/>
+          <w:lang w:val="en-US" w:eastAsia="zh-CN"/>
+        </w:rPr>
+      </w:pPr>
+      <w:r>
+        <w:rPr>
+          <w:rFonts w:hint="eastAsia"/>
+          <w:position w:val="-14"/>
+          <w:lang w:val="en-US" w:eastAsia="zh-CN"/>
+        </w:rPr>
+        <w:t>**[论文</w:t>
+      </w:r>
+      <w:r>
+        <w:rPr>
+          <w:rFonts w:hint="default"/>
+          <w:position w:val="-14"/>
+          <w:lang w:val="en-US" w:eastAsia="zh-CN"/>
+        </w:rPr>
+        <w:t>3</w:t>
+      </w:r>
+      <w:r>
+        <w:rPr>
+          <w:rFonts w:hint="eastAsia"/>
+          <w:position w:val="-14"/>
+          <w:lang w:val="en-US" w:eastAsia="zh-CN"/>
+        </w:rPr>
+        <w:t xml:space="preserve">]: </w:t>
+      </w:r>
+      <w:r>
+        <w:rPr>
+          <w:rFonts w:hint="default"/>
+          <w:position w:val="-14"/>
+          <w:lang w:val="en-US" w:eastAsia="zh-CN"/>
+        </w:rPr>
+        <w:t>单面组件在严寒环境下冬季雪损平均达 33.12%。</w:t>
+      </w:r>
+    </w:p>
+    <w:p>
+      <w:pPr>
+        <w:rPr>
+          <w:rFonts w:hint="default"/>
+          <w:position w:val="-14"/>
+          <w:lang w:val="en-US" w:eastAsia="zh-CN"/>
+        </w:rPr>
+      </w:pPr>
+      <w:r>
+        <w:rPr>
+          <w:rFonts w:hint="default"/>
+          <w:position w:val="-14"/>
+          <w:lang w:val="en-US" w:eastAsia="zh-CN"/>
+        </w:rPr>
+        <w:t>落地逻辑（Marion 模型）：</w:t>
+      </w:r>
+    </w:p>
+    <w:p>
+      <w:pPr>
+        <w:rPr>
+          <w:rFonts w:hint="default"/>
+          <w:position w:val="-14"/>
+          <w:lang w:val="en-US" w:eastAsia="zh-CN"/>
+        </w:rPr>
+      </w:pPr>
+      <w:r>
+        <w:rPr>
+          <w:rFonts w:hint="default"/>
+          <w:position w:val="-14"/>
+          <w:lang w:val="en-US" w:eastAsia="zh-CN"/>
+        </w:rPr>
+        <w:t>判定滑动： 当 Tambient​&gt;GPOA​/(−80) 时，雪开始滑动。</w:t>
+      </w:r>
+    </w:p>
+    <w:p>
+      <w:pPr>
+        <w:rPr>
+          <w:rFonts w:hint="default"/>
+          <w:position w:val="-14"/>
+          <w:lang w:val="en-US" w:eastAsia="zh-CN"/>
+        </w:rPr>
+      </w:pPr>
+      <w:r>
+        <w:rPr>
+          <w:rFonts w:hint="default"/>
+          <w:position w:val="-14"/>
+          <w:lang w:val="en-US" w:eastAsia="zh-CN"/>
+        </w:rPr>
+        <w:t>单面板劣势： 单面板没有背面加热效应，雪滑得比双面板慢得多。</w:t>
+      </w:r>
+    </w:p>
+    <w:p>
+      <w:pPr>
+        <w:rPr>
+          <w:rFonts w:hint="default"/>
+          <w:position w:val="-14"/>
+          <w:lang w:val="en-US" w:eastAsia="zh-CN"/>
+        </w:rPr>
+      </w:pPr>
+      <w:r>
+        <w:rPr>
+          <w:rFonts w:hint="default"/>
+          <w:position w:val="-14"/>
+          <w:lang w:val="en-US" w:eastAsia="zh-CN"/>
+        </w:rPr>
+        <w:t>雪深影响： 来源 5 发现，当雪深超过 3cm 时，由于地面干扰（Ground Interference），滑动系数 sc 会从 0.4 锐减至 0.06。</w:t>
+      </w:r>
+    </w:p>
+    <w:p>
+      <w:pPr>
+        <w:rPr>
+          <w:rFonts w:hint="default"/>
+          <w:position w:val="-14"/>
+          <w:lang w:val="en-US" w:eastAsia="zh-CN"/>
+        </w:rPr>
+      </w:pPr>
+    </w:p>
+    <w:p>
+      <w:pPr>
+        <w:rPr>
+          <w:rFonts w:hint="eastAsia"/>
+          <w:position w:val="-14"/>
+          <w:lang w:val="en-US" w:eastAsia="zh-CN"/>
+        </w:rPr>
+      </w:pPr>
+      <w:r>
+        <w:rPr>
+          <w:rFonts w:hint="eastAsia"/>
+          <w:position w:val="-14"/>
+          <w:lang w:val="en-US" w:eastAsia="zh-CN"/>
+        </w:rPr>
+        <w:t>---&gt;电气失配与安装排布（Portrait vs. Landscape）</w:t>
+      </w:r>
+    </w:p>
+    <w:p>
+      <w:pPr>
+        <w:rPr>
+          <w:rFonts w:hint="eastAsia"/>
+          <w:position w:val="-14"/>
+          <w:lang w:val="en-US" w:eastAsia="zh-CN"/>
+        </w:rPr>
+      </w:pPr>
+      <w:r>
+        <w:rPr>
+          <w:rFonts w:hint="eastAsia"/>
+          <w:position w:val="-14"/>
+          <w:lang w:val="en-US" w:eastAsia="zh-CN"/>
+        </w:rPr>
+        <w:t>模型目前计算的是“面”的辐照度，但实际发电取决于“组串”的电流。</w:t>
+      </w:r>
+    </w:p>
+    <w:p>
+      <w:pPr>
+        <w:rPr>
+          <w:rFonts w:hint="eastAsia"/>
+          <w:position w:val="-14"/>
+          <w:lang w:val="en-US" w:eastAsia="zh-CN"/>
+        </w:rPr>
+      </w:pPr>
+      <w:r>
+        <w:rPr>
+          <w:rFonts w:hint="eastAsia"/>
+          <w:position w:val="-14"/>
+          <w:lang w:val="en-US" w:eastAsia="zh-CN"/>
+        </w:rPr>
+        <w:t>阴影特征：积雪通常从顶部下滑并堆积在组件底部。</w:t>
+      </w:r>
+    </w:p>
+    <w:p>
+      <w:pPr>
+        <w:rPr>
+          <w:rFonts w:hint="eastAsia"/>
+          <w:position w:val="-14"/>
+          <w:lang w:val="en-US" w:eastAsia="zh-CN"/>
+        </w:rPr>
+      </w:pPr>
+      <w:r>
+        <w:rPr>
+          <w:rFonts w:hint="eastAsia"/>
+          <w:position w:val="-14"/>
+          <w:lang w:val="en-US" w:eastAsia="zh-CN"/>
+        </w:rPr>
+        <w:t>排布影响：</w:t>
+      </w:r>
+    </w:p>
+    <w:p>
+      <w:pPr>
+        <w:rPr>
+          <w:rFonts w:hint="eastAsia"/>
+          <w:position w:val="-14"/>
+          <w:lang w:val="en-US" w:eastAsia="zh-CN"/>
+        </w:rPr>
+      </w:pPr>
+      <w:r>
+        <w:rPr>
+          <w:rFonts w:hint="eastAsia"/>
+          <w:position w:val="-14"/>
+          <w:lang w:val="en-US" w:eastAsia="zh-CN"/>
+        </w:rPr>
+        <w:t>纵向（Portrait）： 即使只有底部 10% 的雪，也会切断整个组串电流，导致 100% 功率损失。</w:t>
+      </w:r>
+    </w:p>
+    <w:p>
+      <w:pPr>
+        <w:rPr>
+          <w:rFonts w:hint="eastAsia"/>
+          <w:position w:val="-14"/>
+          <w:lang w:val="en-US" w:eastAsia="zh-CN"/>
+        </w:rPr>
+      </w:pPr>
+      <w:r>
+        <w:rPr>
+          <w:rFonts w:hint="eastAsia"/>
+          <w:position w:val="-14"/>
+          <w:lang w:val="en-US" w:eastAsia="zh-CN"/>
+        </w:rPr>
+        <w:t>横向（Landscape）： 配合旁路二极管，可以保留上方未遮挡区域的电力。</w:t>
+      </w:r>
+    </w:p>
+    <w:p>
+      <w:pPr>
+        <w:rPr>
+          <w:rFonts w:hint="eastAsia"/>
+          <w:position w:val="-14"/>
+          <w:lang w:val="en-US" w:eastAsia="zh-CN"/>
+        </w:rPr>
+      </w:pPr>
+      <w:r>
+        <w:rPr>
+          <w:rFonts w:hint="eastAsia"/>
+          <w:position w:val="-14"/>
+          <w:lang w:val="en-US" w:eastAsia="zh-CN"/>
+        </w:rPr>
+        <w:t>对 DW 的优化意义： 如果最优β较小，必须在模型中加入一个“布局折减因子”,或者强制建议在南极采用横向排布。</w:t>
+      </w:r>
+    </w:p>
+    <w:p>
+      <w:pPr>
+        <w:rPr>
+          <w:rFonts w:hint="default"/>
+          <w:position w:val="-14"/>
+          <w:lang w:val="en-US" w:eastAsia="zh-CN"/>
+        </w:rPr>
+      </w:pPr>
+    </w:p>
+    <w:p>
+      <w:pPr>
+        <w:rPr>
+          <w:rFonts w:hint="eastAsia"/>
+          <w:position w:val="-14"/>
+          <w:lang w:val="en-US" w:eastAsia="zh-CN"/>
+        </w:rPr>
+      </w:pPr>
+      <w:r>
+        <w:rPr>
+          <w:rFonts w:hint="eastAsia"/>
+          <w:position w:val="-14"/>
+          <w:lang w:val="en-US" w:eastAsia="zh-CN"/>
+        </w:rPr>
+        <w:t>---&gt;阵列自遮挡（Ground Self-Shading）</w:t>
+      </w:r>
+    </w:p>
+    <w:p>
+      <w:pPr>
+        <w:rPr>
+          <w:rFonts w:hint="eastAsia"/>
+          <w:position w:val="-14"/>
+          <w:lang w:val="en-US" w:eastAsia="zh-CN"/>
+        </w:rPr>
+      </w:pPr>
+      <w:r>
+        <w:rPr>
+          <w:rFonts w:hint="eastAsia"/>
+          <w:position w:val="-14"/>
+          <w:lang w:val="en-US" w:eastAsia="zh-CN"/>
+        </w:rPr>
+        <w:t>[论文2] 光伏阵列会在地面投射长阴影。</w:t>
+      </w:r>
+    </w:p>
+    <w:p>
+      <w:pPr>
+        <w:rPr>
+          <w:rFonts w:hint="eastAsia"/>
+          <w:position w:val="-14"/>
+          <w:lang w:val="en-US" w:eastAsia="zh-CN"/>
+        </w:rPr>
+      </w:pPr>
+      <w:r>
+        <w:rPr>
+          <w:rFonts w:hint="eastAsia"/>
+          <w:position w:val="-14"/>
+          <w:lang w:val="en-US" w:eastAsia="zh-CN"/>
+        </w:rPr>
+        <w:t>GD 项假设地面是全亮的，但在南极极低太阳角下，组件前面的地面很大一部分处于阵列自身的阴影中。</w:t>
+      </w:r>
+    </w:p>
+    <w:p>
+      <w:pPr>
+        <w:rPr>
+          <w:rFonts w:hint="eastAsia"/>
+          <w:position w:val="-14"/>
+          <w:lang w:val="en-US" w:eastAsia="zh-CN"/>
+        </w:rPr>
+      </w:pPr>
+      <w:r>
+        <w:rPr>
+          <w:rFonts w:hint="eastAsia"/>
+          <w:position w:val="-14"/>
+          <w:lang w:val="en-US" w:eastAsia="zh-CN"/>
+        </w:rPr>
+        <w:t>需要对 αeff</w:t>
+      </w:r>
+      <w:r>
+        <w:rPr>
+          <w:rFonts w:hint="default"/>
+          <w:position w:val="-14"/>
+          <w:lang w:val="en-US" w:eastAsia="zh-CN"/>
+        </w:rPr>
+        <w:t>’</w:t>
+      </w:r>
+      <w:r>
+        <w:rPr>
+          <w:rFonts w:hint="eastAsia"/>
+          <w:position w:val="-14"/>
+          <w:lang w:val="en-US" w:eastAsia="zh-CN"/>
+        </w:rPr>
+        <w:t>(t) 项进行几何阴影折减。如果光伏板“看到”的地面 50% 是黑的，那么反射项的贡献也要减半。</w:t>
+      </w:r>
+    </w:p>
+    <w:p>
+      <w:pPr>
+        <w:rPr>
+          <w:rFonts w:hint="default"/>
+          <w:position w:val="-14"/>
+          <w:lang w:val="en-US" w:eastAsia="zh-CN"/>
+        </w:rPr>
+      </w:pPr>
+    </w:p>
+    <w:p>
+      <w:pPr>
+        <w:rPr>
+          <w:rFonts w:hint="default"/>
+          <w:position w:val="-14"/>
+          <w:lang w:val="en-US" w:eastAsia="zh-CN"/>
+        </w:rPr>
+      </w:pPr>
+      <w:r>
+        <w:rPr>
+          <w:rFonts w:hint="eastAsia"/>
+          <w:position w:val="-14"/>
+          <w:lang w:val="en-US" w:eastAsia="zh-CN"/>
+        </w:rPr>
+        <w:t>---&gt;双面或许更优</w:t>
       </w:r>
       <w:bookmarkStart w:id="0" w:name="_GoBack"/>
       <w:bookmarkEnd w:id="0"/>
@@ -1432,23 +2258,28 @@
     <w:p>
       <w:pPr>
         <w:rPr>
-          <w:position w:val="-14"/>
-        </w:rPr>
-      </w:pPr>
-      <w:r>
-        <w:rPr>
-          <w:rFonts w:hint="default"/>
-          <w:position w:val="-14"/>
-        </w:rPr>
-        <w:t>如果不进行截断或降权，模型会极大地高估南极早晚（或长达数月的低角度光照期）的能量收益。</w:t>
-      </w:r>
-    </w:p>
-    <w:p>
-      <w:pPr>
-        <w:rPr>
-          <w:position w:val="-14"/>
-        </w:rPr>
-      </w:pPr>
+          <w:rFonts w:hint="default"/>
+          <w:position w:val="-14"/>
+          <w:lang w:val="en-US" w:eastAsia="zh-CN"/>
+        </w:rPr>
+      </w:pPr>
+    </w:p>
+    <w:p>
+      <w:pPr>
+        <w:rPr>
+          <w:rFonts w:hint="default"/>
+          <w:position w:val="-14"/>
+          <w:lang w:val="en-US" w:eastAsia="zh-CN"/>
+        </w:rPr>
+      </w:pPr>
+      <w:r>
+        <w:rPr>
+          <w:rFonts w:hint="eastAsia"/>
+          <w:position w:val="-14"/>
+          <w:lang w:val="en-US" w:eastAsia="zh-CN"/>
+        </w:rPr>
+        <w:t>------------------------------------------------------------------------------------------------------------------------------</w:t>
+      </w:r>
     </w:p>
     <w:p>
       <w:pPr>

</xml_diff>